<commit_message>
make templates pandadocs compatible
</commit_message>
<xml_diff>
--- a/templates/action-of-incorporator-ccorp.docx
+++ b/templates/action-of-incorporator-ccorp.docx
@@ -2,29 +2,6 @@
 <file path=word/document.xml><?xml version="1.0" encoding="utf-8"?>
 <w:document xmlns:o="urn:schemas-microsoft-com:office:office" xmlns:r="http://schemas.openxmlformats.org/officeDocument/2006/relationships" xmlns:v="urn:schemas-microsoft-com:vml" xmlns:w="http://schemas.openxmlformats.org/wordprocessingml/2006/main" xmlns:w10="urn:schemas-microsoft-com:office:word" xmlns:wp="http://schemas.openxmlformats.org/drawingml/2006/wordprocessingDrawing" xmlns:pic="http://schemas.openxmlformats.org/drawingml/2006/picture" xmlns:wps="http://schemas.microsoft.com/office/word/2010/wordprocessingShape" xmlns:wpg="http://schemas.microsoft.com/office/word/2010/wordprocessingGroup" xmlns:mc="http://schemas.openxmlformats.org/markup-compatibility/2006" xmlns:wp14="http://schemas.microsoft.com/office/word/2010/wordprocessingDrawing" xmlns:w14="http://schemas.microsoft.com/office/word/2010/wordml" xmlns:w15="http://schemas.microsoft.com/office/word/2012/wordml" mc:Ignorable="w14 wp14 w15">
   <w:body>
-    <w:p>
-      <w:pPr>
-        <w:spacing w:after="240"/>
-        <w:jc w:val="left"/>
-      </w:pPr>
-      <w:r>
-        <w:rPr>
-          <w:b/>
-          <w:i/>
-          <w:sz w:val="20"/>
-          <w:szCs w:val="20"/>
-        </w:rPr>
-        <w:t xml:space="preserve">Drafting note (delete before use): </w:t>
-      </w:r>
-      <w:r>
-        <w:rPr>
-          <w:i/>
-          <w:sz w:val="20"/>
-          <w:szCs w:val="20"/>
-        </w:rPr>
-        <w:t xml:space="preserve">The first step in organizing the corporation: the incorporator adopts the Bylaws, names the initial director(s), and then resigns. For a single-founder company the incorporator is usually the founder (or counsel assisting with the formation). Pair this with the Organizational Resolutions. Replace bracketed terms. Note: the company name must be used exactly as it appears in the Certificate of Incorporation, including the “, Inc.” suffix and punctuation.</w:t>
-      </w:r>
-    </w:p>
     <w:p>
       <w:pPr>
         <w:pStyle w:val="normal1"/>
@@ -90,7 +67,7 @@
           <w:sz w:val="26"/>
           <w:szCs w:val="26"/>
         </w:rPr>
-        <w:t>[COMPANY NAME]</w:t>
+        <w:t>{Company Name Upper}</w:t>
       </w:r>
       <w:r>
         <w:rPr>
@@ -115,7 +92,7 @@
           <w:sz w:val="26"/>
           <w:szCs w:val="26"/>
         </w:rPr>
-        <w:t>, INC.</w:t>
+        <w:t/>
       </w:r>
       <w:r>
         <w:rPr>
@@ -140,7 +117,7 @@
           <w:sz w:val="22"/>
           <w:szCs w:val="22"/>
         </w:rPr>
-        <w:t>[DATE]</w:t>
+        <w:t>{Effective Date}</w:t>
       </w:r>
     </w:p>
     <w:p>
@@ -152,7 +129,7 @@
       </w:pPr>
       <w:r>
         <w:rPr/>
-        <w:t>Pursuant to Sections 107 and 108 of the General Corporation Law of the State of Delaware, the undersigned, being the incorporator (the “Incorporator”) of [COMPANY NAME], Inc., a Delaware corporation (the “Corporation”), takes the following action by written consent:</w:t>
+        <w:t>Pursuant to Sections 107 and 108 of the General Corporation Law of the State of Delaware, the undersigned, being the incorporator (the “Incorporator”) of {Company Name}, a Delaware corporation (the “Corporation”), takes the following action by written consent:</w:t>
       </w:r>
     </w:p>
     <w:p>
@@ -256,7 +233,7 @@
       </w:pPr>
       <w:r>
         <w:rPr/>
-        <w:t>RESOLVED, that [DIRECTOR NAME], a natural person, is elected as the sole director of the Corporation, to serve until a successor is duly elected and qualified or until earlier resignation or removal. [To start with more than one director, list each additional natural person here.]</w:t>
+        <w:t>RESOLVED, that {Director Name}, a natural person, is elected as the sole director of the Corporation, to serve until a successor is duly elected and qualified or until earlier resignation or removal.</w:t>
       </w:r>
     </w:p>
     <w:p>
@@ -279,7 +256,7 @@
       </w:pPr>
       <w:r>
         <w:rPr/>
-        <w:t>______________________________</w:t>
+        <w:t>{signature:incorporator_____}</w:t>
       </w:r>
     </w:p>
     <w:p>
@@ -290,7 +267,7 @@
       </w:pPr>
       <w:r>
         <w:rPr/>
-        <w:t>[INCORPORATOR NAME], Incorporator</w:t>
+        <w:t>{Incorporator Name}, Incorporator</w:t>
       </w:r>
       <w:r>
         <w:br w:type="page"/>
@@ -339,7 +316,7 @@
       </w:pPr>
       <w:r>
         <w:rPr/>
-        <w:t>[Attach the adopted Bylaws.]</w:t>
+        <w:t>The Bylaws follow this Action in the execution packet.</w:t>
       </w:r>
     </w:p>
     <w:sectPr>
@@ -506,7 +483,7 @@
         <w:sz w:val="20"/>
         <w:szCs w:val="20"/>
       </w:rPr>
-      <w:t>[COMPANY NAME], INC. — Action of Incorporator</w:t>
+      <w:t>{Company Name Upper} — Action of Incorporator</w:t>
     </w:r>
   </w:p>
 </w:hdr>
@@ -528,7 +505,7 @@
         <w:sz w:val="20"/>
         <w:szCs w:val="20"/>
       </w:rPr>
-      <w:t>[COMPANY NAME], INC. — Action of Incorporator</w:t>
+      <w:t>{Company Name Upper} — Action of Incorporator</w:t>
     </w:r>
   </w:p>
 </w:hdr>

</xml_diff>